<commit_message>
atualizacao da ata e do projeto da reuniao
</commit_message>
<xml_diff>
--- a/Ata_da_Reuniao_Inicial.docx
+++ b/Ata_da_Reuniao_Inicial.docx
@@ -2610,7 +2610,28 @@
               <w:t xml:space="preserve">os </w:t>
             </w:r>
             <w:r>
-              <w:t>filtros do relatório</w:t>
+              <w:t xml:space="preserve">filtros </w:t>
+            </w:r>
+            <w:r>
+              <w:t>(</w:t>
+            </w:r>
+            <w:r>
+              <w:t>tipos de</w:t>
+            </w:r>
+            <w:r>
+              <w:t xml:space="preserve"> infração) </w:t>
+            </w:r>
+            <w:r>
+              <w:t>do relatório</w:t>
+            </w:r>
+            <w:r>
+              <w:t xml:space="preserve"> que serão cadastrad</w:t>
+            </w:r>
+            <w:r>
+              <w:t>os e os respectivos valores das multas</w:t>
+            </w:r>
+            <w:r>
+              <w:t>.</w:t>
             </w:r>
           </w:p>
         </w:tc>
@@ -2632,7 +2653,7 @@
               </w:tabs>
             </w:pPr>
             <w:r>
-              <w:t>Outra empresa</w:t>
+              <w:t>Cliente</w:t>
             </w:r>
           </w:p>
         </w:tc>
@@ -2654,7 +2675,16 @@
               </w:tabs>
             </w:pPr>
             <w:r>
-              <w:t>05/03/2007</w:t>
+              <w:t>05/</w:t>
+            </w:r>
+            <w:r>
+              <w:t>10</w:t>
+            </w:r>
+            <w:r>
+              <w:t>/20</w:t>
+            </w:r>
+            <w:r>
+              <w:t>26</w:t>
             </w:r>
           </w:p>
         </w:tc>
@@ -2677,6 +2707,10 @@
           <w:p>
             <w:pPr>
               <w:pStyle w:val="Ata-itensNumerados"/>
+              <w:numPr>
+                <w:ilvl w:val="0"/>
+                <w:numId w:val="7"/>
+              </w:numPr>
               <w:tabs>
                 <w:tab w:val="left" w:pos="612"/>
               </w:tabs>
@@ -2708,7 +2742,13 @@
               </w:tabs>
             </w:pPr>
             <w:r>
-              <w:t>Placa do carro associada com a unidade</w:t>
+              <w:t xml:space="preserve">Verificar caso um proprietário possua mais de uma </w:t>
+            </w:r>
+            <w:r>
+              <w:t xml:space="preserve">unidade ocorra uma infração dele em área comum, quem será responsável por definir a unidade à qual </w:t>
+            </w:r>
+            <w:r>
+              <w:t>a ocorrência será associada.</w:t>
             </w:r>
           </w:p>
         </w:tc>
@@ -2730,7 +2770,7 @@
               </w:tabs>
             </w:pPr>
             <w:r>
-              <w:t>Empresa</w:t>
+              <w:t>Cliente</w:t>
             </w:r>
           </w:p>
         </w:tc>
@@ -2752,7 +2792,346 @@
               </w:tabs>
             </w:pPr>
             <w:r>
-              <w:t>05/03/2007</w:t>
+              <w:t>05/10/2026</w:t>
+            </w:r>
+          </w:p>
+        </w:tc>
+      </w:tr>
+      <w:tr>
+        <w:trPr>
+          <w:trHeight w:val="55"/>
+        </w:trPr>
+        <w:tc>
+          <w:tcPr>
+            <w:tcW w:w="717" w:type="dxa"/>
+            <w:gridSpan w:val="2"/>
+            <w:tcBorders>
+              <w:top w:val="single" w:sz="4" w:space="0" w:color="000000"/>
+              <w:left w:val="single" w:sz="4" w:space="0" w:color="000000"/>
+              <w:bottom w:val="single" w:sz="4" w:space="0" w:color="000000"/>
+              <w:right w:val="single" w:sz="4" w:space="0" w:color="000000"/>
+            </w:tcBorders>
+          </w:tcPr>
+          <w:p>
+            <w:pPr>
+              <w:pStyle w:val="Ata-itensNumerados"/>
+              <w:numPr>
+                <w:ilvl w:val="0"/>
+                <w:numId w:val="7"/>
+              </w:numPr>
+              <w:tabs>
+                <w:tab w:val="left" w:pos="612"/>
+              </w:tabs>
+              <w:snapToGrid w:val="0"/>
+              <w:ind w:left="0" w:firstLine="0"/>
+              <w:rPr>
+                <w:b/>
+                <w:bCs/>
+              </w:rPr>
+            </w:pPr>
+          </w:p>
+        </w:tc>
+        <w:tc>
+          <w:tcPr>
+            <w:tcW w:w="6086" w:type="dxa"/>
+            <w:gridSpan w:val="8"/>
+            <w:tcBorders>
+              <w:top w:val="single" w:sz="4" w:space="0" w:color="000000"/>
+              <w:left w:val="single" w:sz="4" w:space="0" w:color="000000"/>
+              <w:bottom w:val="single" w:sz="4" w:space="0" w:color="000000"/>
+              <w:right w:val="single" w:sz="4" w:space="0" w:color="000000"/>
+            </w:tcBorders>
+          </w:tcPr>
+          <w:p>
+            <w:pPr>
+              <w:pStyle w:val="Ata-corpo"/>
+              <w:tabs>
+                <w:tab w:val="left" w:pos="612"/>
+              </w:tabs>
+            </w:pPr>
+            <w:r>
+              <w:t>Definir os modelos padrões das</w:t>
+            </w:r>
+            <w:r>
+              <w:t xml:space="preserve"> </w:t>
+            </w:r>
+            <w:r>
+              <w:t>mensagens de notificações e de multas</w:t>
+            </w:r>
+            <w:r>
+              <w:t xml:space="preserve"> que serão utilizados no sistema</w:t>
+            </w:r>
+            <w:r>
+              <w:t>.</w:t>
+            </w:r>
+          </w:p>
+        </w:tc>
+        <w:tc>
+          <w:tcPr>
+            <w:tcW w:w="1764" w:type="dxa"/>
+            <w:tcBorders>
+              <w:top w:val="single" w:sz="4" w:space="0" w:color="000000"/>
+              <w:left w:val="single" w:sz="4" w:space="0" w:color="000000"/>
+              <w:bottom w:val="single" w:sz="4" w:space="0" w:color="000000"/>
+              <w:right w:val="single" w:sz="4" w:space="0" w:color="000000"/>
+            </w:tcBorders>
+          </w:tcPr>
+          <w:p>
+            <w:pPr>
+              <w:pStyle w:val="Ata-corpo"/>
+              <w:tabs>
+                <w:tab w:val="left" w:pos="612"/>
+              </w:tabs>
+            </w:pPr>
+            <w:r>
+              <w:t>Cliente</w:t>
+            </w:r>
+          </w:p>
+        </w:tc>
+        <w:tc>
+          <w:tcPr>
+            <w:tcW w:w="1639" w:type="dxa"/>
+            <w:tcBorders>
+              <w:top w:val="single" w:sz="4" w:space="0" w:color="000000"/>
+              <w:left w:val="single" w:sz="4" w:space="0" w:color="000000"/>
+              <w:bottom w:val="single" w:sz="4" w:space="0" w:color="000000"/>
+              <w:right w:val="single" w:sz="4" w:space="0" w:color="000000"/>
+            </w:tcBorders>
+          </w:tcPr>
+          <w:p>
+            <w:pPr>
+              <w:pStyle w:val="Ata-corpo"/>
+              <w:tabs>
+                <w:tab w:val="left" w:pos="612"/>
+              </w:tabs>
+            </w:pPr>
+            <w:r>
+              <w:t>0</w:t>
+            </w:r>
+            <w:r>
+              <w:t>6</w:t>
+            </w:r>
+            <w:r>
+              <w:t>/10/2026</w:t>
+            </w:r>
+          </w:p>
+        </w:tc>
+      </w:tr>
+      <w:tr>
+        <w:trPr>
+          <w:trHeight w:val="55"/>
+        </w:trPr>
+        <w:tc>
+          <w:tcPr>
+            <w:tcW w:w="717" w:type="dxa"/>
+            <w:gridSpan w:val="2"/>
+            <w:tcBorders>
+              <w:top w:val="single" w:sz="4" w:space="0" w:color="000000"/>
+              <w:left w:val="single" w:sz="4" w:space="0" w:color="000000"/>
+              <w:bottom w:val="single" w:sz="4" w:space="0" w:color="000000"/>
+              <w:right w:val="single" w:sz="4" w:space="0" w:color="000000"/>
+            </w:tcBorders>
+          </w:tcPr>
+          <w:p>
+            <w:pPr>
+              <w:pStyle w:val="Ata-itensNumerados"/>
+              <w:numPr>
+                <w:ilvl w:val="0"/>
+                <w:numId w:val="7"/>
+              </w:numPr>
+              <w:tabs>
+                <w:tab w:val="left" w:pos="612"/>
+              </w:tabs>
+              <w:snapToGrid w:val="0"/>
+              <w:ind w:left="0" w:firstLine="0"/>
+              <w:rPr>
+                <w:b/>
+                <w:bCs/>
+              </w:rPr>
+            </w:pPr>
+          </w:p>
+        </w:tc>
+        <w:tc>
+          <w:tcPr>
+            <w:tcW w:w="6086" w:type="dxa"/>
+            <w:gridSpan w:val="8"/>
+            <w:tcBorders>
+              <w:top w:val="single" w:sz="4" w:space="0" w:color="000000"/>
+              <w:left w:val="single" w:sz="4" w:space="0" w:color="000000"/>
+              <w:bottom w:val="single" w:sz="4" w:space="0" w:color="000000"/>
+              <w:right w:val="single" w:sz="4" w:space="0" w:color="000000"/>
+            </w:tcBorders>
+          </w:tcPr>
+          <w:p>
+            <w:pPr>
+              <w:pStyle w:val="Ata-corpo"/>
+              <w:tabs>
+                <w:tab w:val="left" w:pos="612"/>
+              </w:tabs>
+            </w:pPr>
+            <w:r>
+              <w:t xml:space="preserve">Definir o prazo de contestação </w:t>
+            </w:r>
+            <w:r>
+              <w:t>das notificações</w:t>
+            </w:r>
+          </w:p>
+        </w:tc>
+        <w:tc>
+          <w:tcPr>
+            <w:tcW w:w="1764" w:type="dxa"/>
+            <w:tcBorders>
+              <w:top w:val="single" w:sz="4" w:space="0" w:color="000000"/>
+              <w:left w:val="single" w:sz="4" w:space="0" w:color="000000"/>
+              <w:bottom w:val="single" w:sz="4" w:space="0" w:color="000000"/>
+              <w:right w:val="single" w:sz="4" w:space="0" w:color="000000"/>
+            </w:tcBorders>
+          </w:tcPr>
+          <w:p>
+            <w:pPr>
+              <w:pStyle w:val="Ata-corpo"/>
+              <w:tabs>
+                <w:tab w:val="left" w:pos="612"/>
+              </w:tabs>
+            </w:pPr>
+            <w:r>
+              <w:t>Cliente</w:t>
+            </w:r>
+          </w:p>
+        </w:tc>
+        <w:tc>
+          <w:tcPr>
+            <w:tcW w:w="1639" w:type="dxa"/>
+            <w:tcBorders>
+              <w:top w:val="single" w:sz="4" w:space="0" w:color="000000"/>
+              <w:left w:val="single" w:sz="4" w:space="0" w:color="000000"/>
+              <w:bottom w:val="single" w:sz="4" w:space="0" w:color="000000"/>
+              <w:right w:val="single" w:sz="4" w:space="0" w:color="000000"/>
+            </w:tcBorders>
+          </w:tcPr>
+          <w:p>
+            <w:pPr>
+              <w:pStyle w:val="Ata-corpo"/>
+              <w:tabs>
+                <w:tab w:val="left" w:pos="612"/>
+              </w:tabs>
+            </w:pPr>
+            <w:r>
+              <w:t>0</w:t>
+            </w:r>
+            <w:r>
+              <w:t>6</w:t>
+            </w:r>
+            <w:r>
+              <w:t>/10/2026</w:t>
+            </w:r>
+          </w:p>
+        </w:tc>
+      </w:tr>
+      <w:tr>
+        <w:trPr>
+          <w:trHeight w:val="55"/>
+        </w:trPr>
+        <w:tc>
+          <w:tcPr>
+            <w:tcW w:w="717" w:type="dxa"/>
+            <w:gridSpan w:val="2"/>
+            <w:tcBorders>
+              <w:top w:val="single" w:sz="4" w:space="0" w:color="000000"/>
+              <w:left w:val="single" w:sz="4" w:space="0" w:color="000000"/>
+              <w:bottom w:val="single" w:sz="4" w:space="0" w:color="000000"/>
+              <w:right w:val="single" w:sz="4" w:space="0" w:color="000000"/>
+            </w:tcBorders>
+          </w:tcPr>
+          <w:p>
+            <w:pPr>
+              <w:pStyle w:val="Ata-itensNumerados"/>
+              <w:numPr>
+                <w:ilvl w:val="0"/>
+                <w:numId w:val="7"/>
+              </w:numPr>
+              <w:tabs>
+                <w:tab w:val="left" w:pos="612"/>
+              </w:tabs>
+              <w:snapToGrid w:val="0"/>
+              <w:ind w:left="0" w:firstLine="0"/>
+              <w:rPr>
+                <w:b/>
+                <w:bCs/>
+              </w:rPr>
+            </w:pPr>
+          </w:p>
+        </w:tc>
+        <w:tc>
+          <w:tcPr>
+            <w:tcW w:w="6086" w:type="dxa"/>
+            <w:gridSpan w:val="8"/>
+            <w:tcBorders>
+              <w:top w:val="single" w:sz="4" w:space="0" w:color="000000"/>
+              <w:left w:val="single" w:sz="4" w:space="0" w:color="000000"/>
+              <w:bottom w:val="single" w:sz="4" w:space="0" w:color="000000"/>
+              <w:right w:val="single" w:sz="4" w:space="0" w:color="000000"/>
+            </w:tcBorders>
+          </w:tcPr>
+          <w:p>
+            <w:pPr>
+              <w:pStyle w:val="Ata-corpo"/>
+              <w:tabs>
+                <w:tab w:val="left" w:pos="612"/>
+              </w:tabs>
+            </w:pPr>
+            <w:r>
+              <w:t>Elaborar a primeira especificação de requisitos com base no levantamento realizado na reunião</w:t>
+            </w:r>
+          </w:p>
+        </w:tc>
+        <w:tc>
+          <w:tcPr>
+            <w:tcW w:w="1764" w:type="dxa"/>
+            <w:tcBorders>
+              <w:top w:val="single" w:sz="4" w:space="0" w:color="000000"/>
+              <w:left w:val="single" w:sz="4" w:space="0" w:color="000000"/>
+              <w:bottom w:val="single" w:sz="4" w:space="0" w:color="000000"/>
+              <w:right w:val="single" w:sz="4" w:space="0" w:color="000000"/>
+            </w:tcBorders>
+          </w:tcPr>
+          <w:p>
+            <w:pPr>
+              <w:pStyle w:val="Ata-corpo"/>
+              <w:tabs>
+                <w:tab w:val="left" w:pos="612"/>
+              </w:tabs>
+            </w:pPr>
+            <w:r>
+              <w:t>Equipe de desenvolvimento</w:t>
+            </w:r>
+          </w:p>
+        </w:tc>
+        <w:tc>
+          <w:tcPr>
+            <w:tcW w:w="1639" w:type="dxa"/>
+            <w:tcBorders>
+              <w:top w:val="single" w:sz="4" w:space="0" w:color="000000"/>
+              <w:left w:val="single" w:sz="4" w:space="0" w:color="000000"/>
+              <w:bottom w:val="single" w:sz="4" w:space="0" w:color="000000"/>
+              <w:right w:val="single" w:sz="4" w:space="0" w:color="000000"/>
+            </w:tcBorders>
+          </w:tcPr>
+          <w:p>
+            <w:pPr>
+              <w:pStyle w:val="Ata-corpo"/>
+              <w:tabs>
+                <w:tab w:val="left" w:pos="612"/>
+              </w:tabs>
+            </w:pPr>
+            <w:r>
+              <w:t>0</w:t>
+            </w:r>
+            <w:r>
+              <w:t>7</w:t>
+            </w:r>
+            <w:r>
+              <w:t>/10/2026</w:t>
             </w:r>
           </w:p>
         </w:tc>

</xml_diff>